<commit_message>
docs(report): cover 'Submitted by' + section 5.5 real-class dataset roster (11 students) + evidence row
</commit_message>
<xml_diff>
--- a/docs/AutoAttendance_Project_Report.docx
+++ b/docs/AutoAttendance_Project_Report.docx
@@ -310,6 +310,36 @@
                 <w:sz w:val="19"/>
               </w:rPr>
               <w:t>One classroom photo → every face detected &amp; matched → AI pre-fills attendance → teacher confirms / corrects / assigns → auditable register</w:t>
+            </w:r>
+          </w:p>
+        </w:tc>
+      </w:tr>
+      <w:tr>
+        <w:tc>
+          <w:tcPr>
+            <w:tcW w:type="dxa" w:w="2304"/>
+          </w:tcPr>
+          <w:p>
+            <w:r/>
+            <w:r>
+              <w:rPr>
+                <w:sz w:val="19"/>
+              </w:rPr>
+              <w:t>Submitted by</w:t>
+            </w:r>
+          </w:p>
+        </w:tc>
+        <w:tc>
+          <w:tcPr>
+            <w:tcW w:type="dxa" w:w="7488"/>
+          </w:tcPr>
+          <w:p>
+            <w:r/>
+            <w:r>
+              <w:rPr>
+                <w:sz w:val="19"/>
+              </w:rPr>
+              <w:t>Aditya Mehra</w:t>
             </w:r>
           </w:p>
         </w:tc>
@@ -2094,6 +2124,753 @@
         </w:rPr>
         <w:t>Phone cameras store pixels sideways and add an EXIF flag telling viewers to rotate. OpenCV and dlib IGNORE that flag — an unprocessed phone upload presents sideways faces and detection fails (proven: 0/6). Every upload is normalized with Pillow: EXIF-transpose to true upright, convert to RGB, downscale to 2000px long side (1600 for enrollment portraits). This also keeps 12MP photos fast and memory-safe on the 512MB free tier.</w:t>
       </w:r>
+    </w:p>
+    <w:p>
+      <w:pPr>
+        <w:pStyle w:val="Heading2"/>
+      </w:pPr>
+      <w:r>
+        <w:t>5.5 Real-classroom dataset — 11 real students enrolled &amp; recognized</w:t>
+      </w:r>
+    </w:p>
+    <w:p>
+      <w:pPr>
+        <w:spacing w:after="120"/>
+      </w:pPr>
+      <w:r>
+        <w:rPr>
+          <w:b w:val="0"/>
+          <w:sz w:val="21"/>
+        </w:rPr>
+        <w:t>The engine was validated on a real class dataset: 11 student portraits (extracted from the class photo-roster PDF) enrolled under rolls US001-US011 via scripts/bulk_enroll.py — each portrait EXIF-normalized and encoded exactly like web enrollment. Results: every student recognized as themselves in four independent variants (original, mirrored, dimmed -35 percent, downscaled 55 percent) — 44/44 correct, all in the auto-approve band (distances 0.017-0.192). Impostor separation held across all 55 classmate pairs (closest 0.453, above the 0.45 auto-approve line). A single group frame containing all eleven faces produced 11 detections and 11 correct roll numbers, every face auto-approved — the exact flow the demo uses.</w:t>
+      </w:r>
+    </w:p>
+    <w:tbl>
+      <w:tblPr>
+        <w:tblStyle w:val="TableGrid"/>
+        <w:tblW w:type="auto" w:w="0"/>
+        <w:jc w:val="center"/>
+        <w:tblLook w:firstColumn="1" w:firstRow="1" w:lastColumn="0" w:lastRow="0" w:noHBand="0" w:noVBand="1" w:val="04A0"/>
+      </w:tblPr>
+      <w:tblGrid>
+        <w:gridCol w:w="2160"/>
+        <w:gridCol w:w="2160"/>
+        <w:gridCol w:w="2160"/>
+        <w:gridCol w:w="2160"/>
+      </w:tblGrid>
+      <w:tr>
+        <w:tc>
+          <w:tcPr>
+            <w:tcW w:type="dxa" w:w="1152"/>
+            <w:shd w:val="clear" w:fill="141A2E"/>
+          </w:tcPr>
+          <w:p>
+            <w:r/>
+            <w:r>
+              <w:rPr>
+                <w:b/>
+                <w:color w:val="FFFFFF"/>
+                <w:sz w:val="19"/>
+              </w:rPr>
+              <w:t>Roll</w:t>
+            </w:r>
+          </w:p>
+        </w:tc>
+        <w:tc>
+          <w:tcPr>
+            <w:tcW w:type="dxa" w:w="2880"/>
+            <w:shd w:val="clear" w:fill="141A2E"/>
+          </w:tcPr>
+          <w:p>
+            <w:r/>
+            <w:r>
+              <w:rPr>
+                <w:b/>
+                <w:color w:val="FFFFFF"/>
+                <w:sz w:val="19"/>
+              </w:rPr>
+              <w:t>Student</w:t>
+            </w:r>
+          </w:p>
+        </w:tc>
+        <w:tc>
+          <w:tcPr>
+            <w:tcW w:type="dxa" w:w="3312"/>
+            <w:shd w:val="clear" w:fill="141A2E"/>
+          </w:tcPr>
+          <w:p>
+            <w:r/>
+            <w:r>
+              <w:rPr>
+                <w:b/>
+                <w:color w:val="FFFFFF"/>
+                <w:sz w:val="19"/>
+              </w:rPr>
+              <w:t>Self-test (orig/mirror/dim/small)</w:t>
+            </w:r>
+          </w:p>
+        </w:tc>
+        <w:tc>
+          <w:tcPr>
+            <w:tcW w:type="dxa" w:w="2448"/>
+            <w:shd w:val="clear" w:fill="141A2E"/>
+          </w:tcPr>
+          <w:p>
+            <w:r/>
+            <w:r>
+              <w:rPr>
+                <w:b/>
+                <w:color w:val="FFFFFF"/>
+                <w:sz w:val="19"/>
+              </w:rPr>
+              <w:t>Group frame</w:t>
+            </w:r>
+          </w:p>
+        </w:tc>
+      </w:tr>
+      <w:tr>
+        <w:tc>
+          <w:tcPr>
+            <w:tcW w:type="dxa" w:w="1152"/>
+          </w:tcPr>
+          <w:p>
+            <w:r/>
+            <w:r>
+              <w:rPr>
+                <w:sz w:val="19"/>
+              </w:rPr>
+              <w:t>US001</w:t>
+            </w:r>
+          </w:p>
+        </w:tc>
+        <w:tc>
+          <w:tcPr>
+            <w:tcW w:type="dxa" w:w="2880"/>
+          </w:tcPr>
+          <w:p>
+            <w:r/>
+            <w:r>
+              <w:rPr>
+                <w:sz w:val="19"/>
+              </w:rPr>
+              <w:t>Utkarsh Sharma</w:t>
+            </w:r>
+          </w:p>
+        </w:tc>
+        <w:tc>
+          <w:tcPr>
+            <w:tcW w:type="dxa" w:w="3312"/>
+          </w:tcPr>
+          <w:p>
+            <w:r/>
+            <w:r>
+              <w:rPr>
+                <w:sz w:val="19"/>
+              </w:rPr>
+              <w:t>4/4 auto-approve</w:t>
+            </w:r>
+          </w:p>
+        </w:tc>
+        <w:tc>
+          <w:tcPr>
+            <w:tcW w:type="dxa" w:w="2448"/>
+          </w:tcPr>
+          <w:p>
+            <w:r/>
+            <w:r>
+              <w:rPr>
+                <w:sz w:val="19"/>
+              </w:rPr>
+              <w:t>auto-approved</w:t>
+            </w:r>
+          </w:p>
+        </w:tc>
+      </w:tr>
+      <w:tr>
+        <w:tc>
+          <w:tcPr>
+            <w:tcW w:type="dxa" w:w="1152"/>
+          </w:tcPr>
+          <w:p>
+            <w:r/>
+            <w:r>
+              <w:rPr>
+                <w:sz w:val="19"/>
+              </w:rPr>
+              <w:t>US002</w:t>
+            </w:r>
+          </w:p>
+        </w:tc>
+        <w:tc>
+          <w:tcPr>
+            <w:tcW w:type="dxa" w:w="2880"/>
+          </w:tcPr>
+          <w:p>
+            <w:r/>
+            <w:r>
+              <w:rPr>
+                <w:sz w:val="19"/>
+              </w:rPr>
+              <w:t>Riya Negi</w:t>
+            </w:r>
+          </w:p>
+        </w:tc>
+        <w:tc>
+          <w:tcPr>
+            <w:tcW w:type="dxa" w:w="3312"/>
+          </w:tcPr>
+          <w:p>
+            <w:r/>
+            <w:r>
+              <w:rPr>
+                <w:sz w:val="19"/>
+              </w:rPr>
+              <w:t>4/4 auto-approve</w:t>
+            </w:r>
+          </w:p>
+        </w:tc>
+        <w:tc>
+          <w:tcPr>
+            <w:tcW w:type="dxa" w:w="2448"/>
+          </w:tcPr>
+          <w:p>
+            <w:r/>
+            <w:r>
+              <w:rPr>
+                <w:sz w:val="19"/>
+              </w:rPr>
+              <w:t>auto-approved</w:t>
+            </w:r>
+          </w:p>
+        </w:tc>
+      </w:tr>
+      <w:tr>
+        <w:tc>
+          <w:tcPr>
+            <w:tcW w:type="dxa" w:w="1152"/>
+          </w:tcPr>
+          <w:p>
+            <w:r/>
+            <w:r>
+              <w:rPr>
+                <w:sz w:val="19"/>
+              </w:rPr>
+              <w:t>US003</w:t>
+            </w:r>
+          </w:p>
+        </w:tc>
+        <w:tc>
+          <w:tcPr>
+            <w:tcW w:type="dxa" w:w="2880"/>
+          </w:tcPr>
+          <w:p>
+            <w:r/>
+            <w:r>
+              <w:rPr>
+                <w:sz w:val="19"/>
+              </w:rPr>
+              <w:t>Sujoy Maity</w:t>
+            </w:r>
+          </w:p>
+        </w:tc>
+        <w:tc>
+          <w:tcPr>
+            <w:tcW w:type="dxa" w:w="3312"/>
+          </w:tcPr>
+          <w:p>
+            <w:r/>
+            <w:r>
+              <w:rPr>
+                <w:sz w:val="19"/>
+              </w:rPr>
+              <w:t>4/4 auto-approve</w:t>
+            </w:r>
+          </w:p>
+        </w:tc>
+        <w:tc>
+          <w:tcPr>
+            <w:tcW w:type="dxa" w:w="2448"/>
+          </w:tcPr>
+          <w:p>
+            <w:r/>
+            <w:r>
+              <w:rPr>
+                <w:sz w:val="19"/>
+              </w:rPr>
+              <w:t>auto-approved</w:t>
+            </w:r>
+          </w:p>
+        </w:tc>
+      </w:tr>
+      <w:tr>
+        <w:tc>
+          <w:tcPr>
+            <w:tcW w:type="dxa" w:w="1152"/>
+          </w:tcPr>
+          <w:p>
+            <w:r/>
+            <w:r>
+              <w:rPr>
+                <w:sz w:val="19"/>
+              </w:rPr>
+              <w:t>US004</w:t>
+            </w:r>
+          </w:p>
+        </w:tc>
+        <w:tc>
+          <w:tcPr>
+            <w:tcW w:type="dxa" w:w="2880"/>
+          </w:tcPr>
+          <w:p>
+            <w:r/>
+            <w:r>
+              <w:rPr>
+                <w:sz w:val="19"/>
+              </w:rPr>
+              <w:t>Priyanka Chavan</w:t>
+            </w:r>
+          </w:p>
+        </w:tc>
+        <w:tc>
+          <w:tcPr>
+            <w:tcW w:type="dxa" w:w="3312"/>
+          </w:tcPr>
+          <w:p>
+            <w:r/>
+            <w:r>
+              <w:rPr>
+                <w:sz w:val="19"/>
+              </w:rPr>
+              <w:t>4/4 auto-approve</w:t>
+            </w:r>
+          </w:p>
+        </w:tc>
+        <w:tc>
+          <w:tcPr>
+            <w:tcW w:type="dxa" w:w="2448"/>
+          </w:tcPr>
+          <w:p>
+            <w:r/>
+            <w:r>
+              <w:rPr>
+                <w:sz w:val="19"/>
+              </w:rPr>
+              <w:t>auto-approved</w:t>
+            </w:r>
+          </w:p>
+        </w:tc>
+      </w:tr>
+      <w:tr>
+        <w:tc>
+          <w:tcPr>
+            <w:tcW w:type="dxa" w:w="1152"/>
+          </w:tcPr>
+          <w:p>
+            <w:r/>
+            <w:r>
+              <w:rPr>
+                <w:sz w:val="19"/>
+              </w:rPr>
+              <w:t>US005</w:t>
+            </w:r>
+          </w:p>
+        </w:tc>
+        <w:tc>
+          <w:tcPr>
+            <w:tcW w:type="dxa" w:w="2880"/>
+          </w:tcPr>
+          <w:p>
+            <w:r/>
+            <w:r>
+              <w:rPr>
+                <w:sz w:val="19"/>
+              </w:rPr>
+              <w:t>Suraj Singh</w:t>
+            </w:r>
+          </w:p>
+        </w:tc>
+        <w:tc>
+          <w:tcPr>
+            <w:tcW w:type="dxa" w:w="3312"/>
+          </w:tcPr>
+          <w:p>
+            <w:r/>
+            <w:r>
+              <w:rPr>
+                <w:sz w:val="19"/>
+              </w:rPr>
+              <w:t>4/4 auto-approve</w:t>
+            </w:r>
+          </w:p>
+        </w:tc>
+        <w:tc>
+          <w:tcPr>
+            <w:tcW w:type="dxa" w:w="2448"/>
+          </w:tcPr>
+          <w:p>
+            <w:r/>
+            <w:r>
+              <w:rPr>
+                <w:sz w:val="19"/>
+              </w:rPr>
+              <w:t>auto-approved</w:t>
+            </w:r>
+          </w:p>
+        </w:tc>
+      </w:tr>
+      <w:tr>
+        <w:tc>
+          <w:tcPr>
+            <w:tcW w:type="dxa" w:w="1152"/>
+          </w:tcPr>
+          <w:p>
+            <w:r/>
+            <w:r>
+              <w:rPr>
+                <w:sz w:val="19"/>
+              </w:rPr>
+              <w:t>US006</w:t>
+            </w:r>
+          </w:p>
+        </w:tc>
+        <w:tc>
+          <w:tcPr>
+            <w:tcW w:type="dxa" w:w="2880"/>
+          </w:tcPr>
+          <w:p>
+            <w:r/>
+            <w:r>
+              <w:rPr>
+                <w:sz w:val="19"/>
+              </w:rPr>
+              <w:t>Akshata Patenkar</w:t>
+            </w:r>
+          </w:p>
+        </w:tc>
+        <w:tc>
+          <w:tcPr>
+            <w:tcW w:type="dxa" w:w="3312"/>
+          </w:tcPr>
+          <w:p>
+            <w:r/>
+            <w:r>
+              <w:rPr>
+                <w:sz w:val="19"/>
+              </w:rPr>
+              <w:t>4/4 auto-approve</w:t>
+            </w:r>
+          </w:p>
+        </w:tc>
+        <w:tc>
+          <w:tcPr>
+            <w:tcW w:type="dxa" w:w="2448"/>
+          </w:tcPr>
+          <w:p>
+            <w:r/>
+            <w:r>
+              <w:rPr>
+                <w:sz w:val="19"/>
+              </w:rPr>
+              <w:t>auto-approved</w:t>
+            </w:r>
+          </w:p>
+        </w:tc>
+      </w:tr>
+      <w:tr>
+        <w:tc>
+          <w:tcPr>
+            <w:tcW w:type="dxa" w:w="1152"/>
+          </w:tcPr>
+          <w:p>
+            <w:r/>
+            <w:r>
+              <w:rPr>
+                <w:sz w:val="19"/>
+              </w:rPr>
+              <w:t>US007</w:t>
+            </w:r>
+          </w:p>
+        </w:tc>
+        <w:tc>
+          <w:tcPr>
+            <w:tcW w:type="dxa" w:w="2880"/>
+          </w:tcPr>
+          <w:p>
+            <w:r/>
+            <w:r>
+              <w:rPr>
+                <w:sz w:val="19"/>
+              </w:rPr>
+              <w:t>Prachi Gupta</w:t>
+            </w:r>
+          </w:p>
+        </w:tc>
+        <w:tc>
+          <w:tcPr>
+            <w:tcW w:type="dxa" w:w="3312"/>
+          </w:tcPr>
+          <w:p>
+            <w:r/>
+            <w:r>
+              <w:rPr>
+                <w:sz w:val="19"/>
+              </w:rPr>
+              <w:t>4/4 auto-approve</w:t>
+            </w:r>
+          </w:p>
+        </w:tc>
+        <w:tc>
+          <w:tcPr>
+            <w:tcW w:type="dxa" w:w="2448"/>
+          </w:tcPr>
+          <w:p>
+            <w:r/>
+            <w:r>
+              <w:rPr>
+                <w:sz w:val="19"/>
+              </w:rPr>
+              <w:t>auto-approved</w:t>
+            </w:r>
+          </w:p>
+        </w:tc>
+      </w:tr>
+      <w:tr>
+        <w:tc>
+          <w:tcPr>
+            <w:tcW w:type="dxa" w:w="1152"/>
+          </w:tcPr>
+          <w:p>
+            <w:r/>
+            <w:r>
+              <w:rPr>
+                <w:sz w:val="19"/>
+              </w:rPr>
+              <w:t>US008</w:t>
+            </w:r>
+          </w:p>
+        </w:tc>
+        <w:tc>
+          <w:tcPr>
+            <w:tcW w:type="dxa" w:w="2880"/>
+          </w:tcPr>
+          <w:p>
+            <w:r/>
+            <w:r>
+              <w:rPr>
+                <w:sz w:val="19"/>
+              </w:rPr>
+              <w:t>Riya Sawant</w:t>
+            </w:r>
+          </w:p>
+        </w:tc>
+        <w:tc>
+          <w:tcPr>
+            <w:tcW w:type="dxa" w:w="3312"/>
+          </w:tcPr>
+          <w:p>
+            <w:r/>
+            <w:r>
+              <w:rPr>
+                <w:sz w:val="19"/>
+              </w:rPr>
+              <w:t>4/4 auto-approve</w:t>
+            </w:r>
+          </w:p>
+        </w:tc>
+        <w:tc>
+          <w:tcPr>
+            <w:tcW w:type="dxa" w:w="2448"/>
+          </w:tcPr>
+          <w:p>
+            <w:r/>
+            <w:r>
+              <w:rPr>
+                <w:sz w:val="19"/>
+              </w:rPr>
+              <w:t>auto-approved</w:t>
+            </w:r>
+          </w:p>
+        </w:tc>
+      </w:tr>
+      <w:tr>
+        <w:tc>
+          <w:tcPr>
+            <w:tcW w:type="dxa" w:w="1152"/>
+          </w:tcPr>
+          <w:p>
+            <w:r/>
+            <w:r>
+              <w:rPr>
+                <w:sz w:val="19"/>
+              </w:rPr>
+              <w:t>US009</w:t>
+            </w:r>
+          </w:p>
+        </w:tc>
+        <w:tc>
+          <w:tcPr>
+            <w:tcW w:type="dxa" w:w="2880"/>
+          </w:tcPr>
+          <w:p>
+            <w:r/>
+            <w:r>
+              <w:rPr>
+                <w:sz w:val="19"/>
+              </w:rPr>
+              <w:t>Pratiksha Wakshe</w:t>
+            </w:r>
+          </w:p>
+        </w:tc>
+        <w:tc>
+          <w:tcPr>
+            <w:tcW w:type="dxa" w:w="3312"/>
+          </w:tcPr>
+          <w:p>
+            <w:r/>
+            <w:r>
+              <w:rPr>
+                <w:sz w:val="19"/>
+              </w:rPr>
+              <w:t>4/4 auto-approve</w:t>
+            </w:r>
+          </w:p>
+        </w:tc>
+        <w:tc>
+          <w:tcPr>
+            <w:tcW w:type="dxa" w:w="2448"/>
+          </w:tcPr>
+          <w:p>
+            <w:r/>
+            <w:r>
+              <w:rPr>
+                <w:sz w:val="19"/>
+              </w:rPr>
+              <w:t>auto-approved</w:t>
+            </w:r>
+          </w:p>
+        </w:tc>
+      </w:tr>
+      <w:tr>
+        <w:tc>
+          <w:tcPr>
+            <w:tcW w:type="dxa" w:w="1152"/>
+          </w:tcPr>
+          <w:p>
+            <w:r/>
+            <w:r>
+              <w:rPr>
+                <w:sz w:val="19"/>
+              </w:rPr>
+              <w:t>US010</w:t>
+            </w:r>
+          </w:p>
+        </w:tc>
+        <w:tc>
+          <w:tcPr>
+            <w:tcW w:type="dxa" w:w="2880"/>
+          </w:tcPr>
+          <w:p>
+            <w:r/>
+            <w:r>
+              <w:rPr>
+                <w:sz w:val="19"/>
+              </w:rPr>
+              <w:t>Aditya Mehra</w:t>
+            </w:r>
+          </w:p>
+        </w:tc>
+        <w:tc>
+          <w:tcPr>
+            <w:tcW w:type="dxa" w:w="3312"/>
+          </w:tcPr>
+          <w:p>
+            <w:r/>
+            <w:r>
+              <w:rPr>
+                <w:sz w:val="19"/>
+              </w:rPr>
+              <w:t>4/4 auto-approve</w:t>
+            </w:r>
+          </w:p>
+        </w:tc>
+        <w:tc>
+          <w:tcPr>
+            <w:tcW w:type="dxa" w:w="2448"/>
+          </w:tcPr>
+          <w:p>
+            <w:r/>
+            <w:r>
+              <w:rPr>
+                <w:sz w:val="19"/>
+              </w:rPr>
+              <w:t>auto-approved</w:t>
+            </w:r>
+          </w:p>
+        </w:tc>
+      </w:tr>
+      <w:tr>
+        <w:tc>
+          <w:tcPr>
+            <w:tcW w:type="dxa" w:w="1152"/>
+          </w:tcPr>
+          <w:p>
+            <w:r/>
+            <w:r>
+              <w:rPr>
+                <w:sz w:val="19"/>
+              </w:rPr>
+              <w:t>US011</w:t>
+            </w:r>
+          </w:p>
+        </w:tc>
+        <w:tc>
+          <w:tcPr>
+            <w:tcW w:type="dxa" w:w="2880"/>
+          </w:tcPr>
+          <w:p>
+            <w:r/>
+            <w:r>
+              <w:rPr>
+                <w:sz w:val="19"/>
+              </w:rPr>
+              <w:t>Darshana Gupta</w:t>
+            </w:r>
+          </w:p>
+        </w:tc>
+        <w:tc>
+          <w:tcPr>
+            <w:tcW w:type="dxa" w:w="3312"/>
+          </w:tcPr>
+          <w:p>
+            <w:r/>
+            <w:r>
+              <w:rPr>
+                <w:sz w:val="19"/>
+              </w:rPr>
+              <w:t>4/4 auto-approve</w:t>
+            </w:r>
+          </w:p>
+        </w:tc>
+        <w:tc>
+          <w:tcPr>
+            <w:tcW w:type="dxa" w:w="2448"/>
+          </w:tcPr>
+          <w:p>
+            <w:r/>
+            <w:r>
+              <w:rPr>
+                <w:sz w:val="19"/>
+              </w:rPr>
+              <w:t>auto-approved</w:t>
+            </w:r>
+          </w:p>
+        </w:tc>
+      </w:tr>
+    </w:tbl>
+    <w:p>
+      <w:pPr>
+        <w:spacing w:after="40"/>
+      </w:pPr>
     </w:p>
     <w:p>
       <w:pPr>
@@ -4555,6 +5332,50 @@
           </w:p>
         </w:tc>
       </w:tr>
+      <w:tr>
+        <w:tc>
+          <w:tcPr>
+            <w:tcW w:type="dxa" w:w="2736"/>
+          </w:tcPr>
+          <w:p>
+            <w:r/>
+            <w:r>
+              <w:rPr>
+                <w:sz w:val="19"/>
+              </w:rPr>
+              <w:t>Real-class dataset (11 students)</w:t>
+            </w:r>
+          </w:p>
+        </w:tc>
+        <w:tc>
+          <w:tcPr>
+            <w:tcW w:type="dxa" w:w="1296"/>
+          </w:tcPr>
+          <w:p>
+            <w:r/>
+            <w:r>
+              <w:rPr>
+                <w:sz w:val="19"/>
+              </w:rPr>
+              <w:t>44/44 + 11/11</w:t>
+            </w:r>
+          </w:p>
+        </w:tc>
+        <w:tc>
+          <w:tcPr>
+            <w:tcW w:type="dxa" w:w="5760"/>
+          </w:tcPr>
+          <w:p>
+            <w:r/>
+            <w:r>
+              <w:rPr>
+                <w:sz w:val="19"/>
+              </w:rPr>
+              <w:t>Self-recognition in 4 variants; 11-face group frame; 55-pair impostor separation</w:t>
+            </w:r>
+          </w:p>
+        </w:tc>
+      </w:tr>
     </w:tbl>
     <w:p>
       <w:pPr>

</xml_diff>